<commit_message>
Knowledge - 5/9/2026 part 4
</commit_message>
<xml_diff>
--- a/Knowledge/3-Work knowledge/1-Software Engineering/2-General Technologies/2-Version Control System/1-Git, GitHub and GitLab/5-My Source/13-Git GUI.docx
+++ b/Knowledge/3-Work knowledge/1-Software Engineering/2-General Technologies/2-Version Control System/1-Git, GitHub and GitLab/5-My Source/13-Git GUI.docx
@@ -29,7 +29,117 @@
           <w:sz w:val="18"/>
           <w:highlight w:val="lightGray"/>
         </w:rPr>
-        <w:t># Source: ScreenShots</w:t>
+        <w:t xml:space="preserve"># Source: </w:t>
+      </w:r>
+      <w:r>
+        <w:rPr>
+          <w:rFonts w:ascii="Arial" w:hAnsi="Arial" w:eastAsia="Arial" w:cs="Arial"/>
+          <w:b/>
+          <w:i w:val="0"/>
+          <w:color w:val="000000"/>
+          <w:sz w:val="18"/>
+          <w:highlight w:val="lightGray"/>
+        </w:rPr>
+        <w:t>S</w:t>
+      </w:r>
+      <w:r>
+        <w:rPr>
+          <w:rFonts w:ascii="Arial" w:hAnsi="Arial" w:eastAsia="Arial" w:cs="Arial"/>
+          <w:b/>
+          <w:i w:val="0"/>
+          <w:color w:val="000000"/>
+          <w:sz w:val="18"/>
+          <w:highlight w:val="lightGray"/>
+        </w:rPr>
+        <w:t>c</w:t>
+      </w:r>
+      <w:r>
+        <w:rPr>
+          <w:rFonts w:ascii="Arial" w:hAnsi="Arial" w:eastAsia="Arial" w:cs="Arial"/>
+          <w:b/>
+          <w:i w:val="0"/>
+          <w:color w:val="000000"/>
+          <w:sz w:val="18"/>
+          <w:highlight w:val="lightGray"/>
+        </w:rPr>
+        <w:t>r</w:t>
+      </w:r>
+      <w:r>
+        <w:rPr>
+          <w:rFonts w:ascii="Arial" w:hAnsi="Arial" w:eastAsia="Arial" w:cs="Arial"/>
+          <w:b/>
+          <w:i w:val="0"/>
+          <w:color w:val="000000"/>
+          <w:sz w:val="18"/>
+          <w:highlight w:val="lightGray"/>
+        </w:rPr>
+        <w:t>e</w:t>
+      </w:r>
+      <w:r>
+        <w:rPr>
+          <w:rFonts w:ascii="Arial" w:hAnsi="Arial" w:eastAsia="Arial" w:cs="Arial"/>
+          <w:b/>
+          <w:i w:val="0"/>
+          <w:color w:val="000000"/>
+          <w:sz w:val="18"/>
+          <w:highlight w:val="lightGray"/>
+        </w:rPr>
+        <w:t>e</w:t>
+      </w:r>
+      <w:r>
+        <w:rPr>
+          <w:rFonts w:ascii="Arial" w:hAnsi="Arial" w:eastAsia="Arial" w:cs="Arial"/>
+          <w:b/>
+          <w:i w:val="0"/>
+          <w:color w:val="000000"/>
+          <w:sz w:val="18"/>
+          <w:highlight w:val="lightGray"/>
+        </w:rPr>
+        <w:t>n</w:t>
+      </w:r>
+      <w:r>
+        <w:rPr>
+          <w:rFonts w:ascii="Arial" w:hAnsi="Arial" w:eastAsia="Arial" w:cs="Arial"/>
+          <w:b/>
+          <w:i w:val="0"/>
+          <w:color w:val="000000"/>
+          <w:sz w:val="18"/>
+          <w:highlight w:val="lightGray"/>
+        </w:rPr>
+        <w:t>S</w:t>
+      </w:r>
+      <w:r>
+        <w:rPr>
+          <w:rFonts w:ascii="Arial" w:hAnsi="Arial" w:eastAsia="Arial" w:cs="Arial"/>
+          <w:b/>
+          <w:i w:val="0"/>
+          <w:color w:val="000000"/>
+          <w:sz w:val="18"/>
+          <w:highlight w:val="lightGray"/>
+        </w:rPr>
+        <w:t>h</w:t>
+      </w:r>
+      <w:r>
+        <w:rPr>
+          <w:rFonts w:ascii="Arial" w:hAnsi="Arial" w:eastAsia="Arial" w:cs="Arial"/>
+          <w:b/>
+          <w:i w:val="0"/>
+          <w:color w:val="000000"/>
+          <w:sz w:val="18"/>
+          <w:highlight w:val="lightGray"/>
+        </w:rPr>
+        <w:t>o</w:t>
+      </w:r>
+      <w:r>
+        <w:rPr>
+          <w:rFonts w:ascii="Arial" w:hAnsi="Arial" w:eastAsia="Arial" w:cs="Arial"/>
+          <w:b/>
+          <w:i w:val="0"/>
+          <w:color w:val="000000"/>
+          <w:sz w:val="18"/>
+          <w:highlight w:val="lightGray"/>
+        </w:rPr>
+        <w:t>t</w:t>
       </w:r>
       <w:r>
         <w:rPr>
@@ -92,7 +202,7 @@
       </w:r>
       <w:r>
         <w:rPr>
-          <w:rFonts w:ascii="Arial" w:eastAsia="Arial" w:hAnsi="Arial" w:cs="Arial"/>
+          <w:rFonts w:ascii="Arial" w:hAnsi="Arial"/>
           <w:b/>
           <w:color w:val="000000"/>
           <w:sz w:val="18"/>
@@ -102,7 +212,7 @@
       </w:r>
       <w:r>
         <w:rPr>
-          <w:rFonts w:ascii="Arial" w:eastAsia="Arial" w:hAnsi="Arial" w:cs="Arial"/>
+          <w:rFonts w:ascii="Arial" w:hAnsi="Arial"/>
           <w:color w:val="000000"/>
           <w:sz w:val="18"/>
           <w:highlight w:val="lightGray"/>
@@ -271,7 +381,117 @@
           <w:sz w:val="18"/>
           <w:highlight w:val="lightGray"/>
         </w:rPr>
-        <w:t># Source: ScreenShots</w:t>
+        <w:t xml:space="preserve"># Source: </w:t>
+      </w:r>
+      <w:r>
+        <w:rPr>
+          <w:rFonts w:ascii="Arial" w:hAnsi="Arial" w:eastAsia="Arial" w:cs="Arial"/>
+          <w:b/>
+          <w:i w:val="0"/>
+          <w:color w:val="000000"/>
+          <w:sz w:val="18"/>
+          <w:highlight w:val="lightGray"/>
+        </w:rPr>
+        <w:t>S</w:t>
+      </w:r>
+      <w:r>
+        <w:rPr>
+          <w:rFonts w:ascii="Arial" w:hAnsi="Arial" w:eastAsia="Arial" w:cs="Arial"/>
+          <w:b/>
+          <w:i w:val="0"/>
+          <w:color w:val="000000"/>
+          <w:sz w:val="18"/>
+          <w:highlight w:val="lightGray"/>
+        </w:rPr>
+        <w:t>c</w:t>
+      </w:r>
+      <w:r>
+        <w:rPr>
+          <w:rFonts w:ascii="Arial" w:hAnsi="Arial" w:eastAsia="Arial" w:cs="Arial"/>
+          <w:b/>
+          <w:i w:val="0"/>
+          <w:color w:val="000000"/>
+          <w:sz w:val="18"/>
+          <w:highlight w:val="lightGray"/>
+        </w:rPr>
+        <w:t>r</w:t>
+      </w:r>
+      <w:r>
+        <w:rPr>
+          <w:rFonts w:ascii="Arial" w:hAnsi="Arial" w:eastAsia="Arial" w:cs="Arial"/>
+          <w:b/>
+          <w:i w:val="0"/>
+          <w:color w:val="000000"/>
+          <w:sz w:val="18"/>
+          <w:highlight w:val="lightGray"/>
+        </w:rPr>
+        <w:t>e</w:t>
+      </w:r>
+      <w:r>
+        <w:rPr>
+          <w:rFonts w:ascii="Arial" w:hAnsi="Arial" w:eastAsia="Arial" w:cs="Arial"/>
+          <w:b/>
+          <w:i w:val="0"/>
+          <w:color w:val="000000"/>
+          <w:sz w:val="18"/>
+          <w:highlight w:val="lightGray"/>
+        </w:rPr>
+        <w:t>e</w:t>
+      </w:r>
+      <w:r>
+        <w:rPr>
+          <w:rFonts w:ascii="Arial" w:hAnsi="Arial" w:eastAsia="Arial" w:cs="Arial"/>
+          <w:b/>
+          <w:i w:val="0"/>
+          <w:color w:val="000000"/>
+          <w:sz w:val="18"/>
+          <w:highlight w:val="lightGray"/>
+        </w:rPr>
+        <w:t>n</w:t>
+      </w:r>
+      <w:r>
+        <w:rPr>
+          <w:rFonts w:ascii="Arial" w:hAnsi="Arial" w:eastAsia="Arial" w:cs="Arial"/>
+          <w:b/>
+          <w:i w:val="0"/>
+          <w:color w:val="000000"/>
+          <w:sz w:val="18"/>
+          <w:highlight w:val="lightGray"/>
+        </w:rPr>
+        <w:t>S</w:t>
+      </w:r>
+      <w:r>
+        <w:rPr>
+          <w:rFonts w:ascii="Arial" w:hAnsi="Arial" w:eastAsia="Arial" w:cs="Arial"/>
+          <w:b/>
+          <w:i w:val="0"/>
+          <w:color w:val="000000"/>
+          <w:sz w:val="18"/>
+          <w:highlight w:val="lightGray"/>
+        </w:rPr>
+        <w:t>h</w:t>
+      </w:r>
+      <w:r>
+        <w:rPr>
+          <w:rFonts w:ascii="Arial" w:hAnsi="Arial" w:eastAsia="Arial" w:cs="Arial"/>
+          <w:b/>
+          <w:i w:val="0"/>
+          <w:color w:val="000000"/>
+          <w:sz w:val="18"/>
+          <w:highlight w:val="lightGray"/>
+        </w:rPr>
+        <w:t>o</w:t>
+      </w:r>
+      <w:r>
+        <w:rPr>
+          <w:rFonts w:ascii="Arial" w:hAnsi="Arial" w:eastAsia="Arial" w:cs="Arial"/>
+          <w:b/>
+          <w:i w:val="0"/>
+          <w:color w:val="000000"/>
+          <w:sz w:val="18"/>
+          <w:highlight w:val="lightGray"/>
+        </w:rPr>
+        <w:t>t</w:t>
       </w:r>
       <w:r>
         <w:rPr>
@@ -334,7 +554,7 @@
       </w:r>
       <w:r>
         <w:rPr>
-          <w:rFonts w:ascii="Arial" w:eastAsia="Arial" w:hAnsi="Arial" w:cs="Arial"/>
+          <w:rFonts w:ascii="Arial" w:hAnsi="Arial"/>
           <w:b/>
           <w:color w:val="000000"/>
           <w:sz w:val="18"/>
@@ -344,7 +564,7 @@
       </w:r>
       <w:r>
         <w:rPr>
-          <w:rFonts w:ascii="Arial" w:eastAsia="Arial" w:hAnsi="Arial" w:cs="Arial"/>
+          <w:rFonts w:ascii="Arial" w:hAnsi="Arial"/>
           <w:color w:val="000000"/>
           <w:sz w:val="18"/>
           <w:highlight w:val="lightGray"/>
@@ -527,7 +747,117 @@
           <w:sz w:val="18"/>
           <w:highlight w:val="lightGray"/>
         </w:rPr>
-        <w:t># Source: ScreenShots</w:t>
+        <w:t xml:space="preserve"># Source: </w:t>
+      </w:r>
+      <w:r>
+        <w:rPr>
+          <w:rFonts w:ascii="Arial" w:hAnsi="Arial" w:eastAsia="Arial" w:cs="Arial"/>
+          <w:b/>
+          <w:i w:val="0"/>
+          <w:color w:val="000000"/>
+          <w:sz w:val="18"/>
+          <w:highlight w:val="lightGray"/>
+        </w:rPr>
+        <w:t>S</w:t>
+      </w:r>
+      <w:r>
+        <w:rPr>
+          <w:rFonts w:ascii="Arial" w:hAnsi="Arial" w:eastAsia="Arial" w:cs="Arial"/>
+          <w:b/>
+          <w:i w:val="0"/>
+          <w:color w:val="000000"/>
+          <w:sz w:val="18"/>
+          <w:highlight w:val="lightGray"/>
+        </w:rPr>
+        <w:t>c</w:t>
+      </w:r>
+      <w:r>
+        <w:rPr>
+          <w:rFonts w:ascii="Arial" w:hAnsi="Arial" w:eastAsia="Arial" w:cs="Arial"/>
+          <w:b/>
+          <w:i w:val="0"/>
+          <w:color w:val="000000"/>
+          <w:sz w:val="18"/>
+          <w:highlight w:val="lightGray"/>
+        </w:rPr>
+        <w:t>r</w:t>
+      </w:r>
+      <w:r>
+        <w:rPr>
+          <w:rFonts w:ascii="Arial" w:hAnsi="Arial" w:eastAsia="Arial" w:cs="Arial"/>
+          <w:b/>
+          <w:i w:val="0"/>
+          <w:color w:val="000000"/>
+          <w:sz w:val="18"/>
+          <w:highlight w:val="lightGray"/>
+        </w:rPr>
+        <w:t>e</w:t>
+      </w:r>
+      <w:r>
+        <w:rPr>
+          <w:rFonts w:ascii="Arial" w:hAnsi="Arial" w:eastAsia="Arial" w:cs="Arial"/>
+          <w:b/>
+          <w:i w:val="0"/>
+          <w:color w:val="000000"/>
+          <w:sz w:val="18"/>
+          <w:highlight w:val="lightGray"/>
+        </w:rPr>
+        <w:t>e</w:t>
+      </w:r>
+      <w:r>
+        <w:rPr>
+          <w:rFonts w:ascii="Arial" w:hAnsi="Arial" w:eastAsia="Arial" w:cs="Arial"/>
+          <w:b/>
+          <w:i w:val="0"/>
+          <w:color w:val="000000"/>
+          <w:sz w:val="18"/>
+          <w:highlight w:val="lightGray"/>
+        </w:rPr>
+        <w:t>n</w:t>
+      </w:r>
+      <w:r>
+        <w:rPr>
+          <w:rFonts w:ascii="Arial" w:hAnsi="Arial" w:eastAsia="Arial" w:cs="Arial"/>
+          <w:b/>
+          <w:i w:val="0"/>
+          <w:color w:val="000000"/>
+          <w:sz w:val="18"/>
+          <w:highlight w:val="lightGray"/>
+        </w:rPr>
+        <w:t>S</w:t>
+      </w:r>
+      <w:r>
+        <w:rPr>
+          <w:rFonts w:ascii="Arial" w:hAnsi="Arial" w:eastAsia="Arial" w:cs="Arial"/>
+          <w:b/>
+          <w:i w:val="0"/>
+          <w:color w:val="000000"/>
+          <w:sz w:val="18"/>
+          <w:highlight w:val="lightGray"/>
+        </w:rPr>
+        <w:t>h</w:t>
+      </w:r>
+      <w:r>
+        <w:rPr>
+          <w:rFonts w:ascii="Arial" w:hAnsi="Arial" w:eastAsia="Arial" w:cs="Arial"/>
+          <w:b/>
+          <w:i w:val="0"/>
+          <w:color w:val="000000"/>
+          <w:sz w:val="18"/>
+          <w:highlight w:val="lightGray"/>
+        </w:rPr>
+        <w:t>o</w:t>
+      </w:r>
+      <w:r>
+        <w:rPr>
+          <w:rFonts w:ascii="Arial" w:hAnsi="Arial" w:eastAsia="Arial" w:cs="Arial"/>
+          <w:b/>
+          <w:i w:val="0"/>
+          <w:color w:val="000000"/>
+          <w:sz w:val="18"/>
+          <w:highlight w:val="lightGray"/>
+        </w:rPr>
+        <w:t>t</w:t>
       </w:r>
       <w:r>
         <w:rPr>
@@ -590,7 +920,7 @@
       </w:r>
       <w:r>
         <w:rPr>
-          <w:rFonts w:ascii="Arial" w:eastAsia="Arial" w:hAnsi="Arial" w:cs="Arial"/>
+          <w:rFonts w:ascii="Arial" w:hAnsi="Arial"/>
           <w:b/>
           <w:color w:val="000000"/>
           <w:sz w:val="18"/>
@@ -600,7 +930,7 @@
       </w:r>
       <w:r>
         <w:rPr>
-          <w:rFonts w:ascii="Arial" w:eastAsia="Arial" w:hAnsi="Arial" w:cs="Arial"/>
+          <w:rFonts w:ascii="Arial" w:hAnsi="Arial"/>
           <w:color w:val="000000"/>
           <w:sz w:val="18"/>
           <w:highlight w:val="lightGray"/>
@@ -726,7 +1056,117 @@
           <w:sz w:val="18"/>
           <w:highlight w:val="lightGray"/>
         </w:rPr>
-        <w:t># Source: ScreenShots</w:t>
+        <w:t xml:space="preserve"># Source: </w:t>
+      </w:r>
+      <w:r>
+        <w:rPr>
+          <w:rFonts w:ascii="Arial" w:hAnsi="Arial" w:eastAsia="Arial" w:cs="Arial"/>
+          <w:b/>
+          <w:i w:val="0"/>
+          <w:color w:val="000000"/>
+          <w:sz w:val="18"/>
+          <w:highlight w:val="lightGray"/>
+        </w:rPr>
+        <w:t>S</w:t>
+      </w:r>
+      <w:r>
+        <w:rPr>
+          <w:rFonts w:ascii="Arial" w:hAnsi="Arial" w:eastAsia="Arial" w:cs="Arial"/>
+          <w:b/>
+          <w:i w:val="0"/>
+          <w:color w:val="000000"/>
+          <w:sz w:val="18"/>
+          <w:highlight w:val="lightGray"/>
+        </w:rPr>
+        <w:t>c</w:t>
+      </w:r>
+      <w:r>
+        <w:rPr>
+          <w:rFonts w:ascii="Arial" w:hAnsi="Arial" w:eastAsia="Arial" w:cs="Arial"/>
+          <w:b/>
+          <w:i w:val="0"/>
+          <w:color w:val="000000"/>
+          <w:sz w:val="18"/>
+          <w:highlight w:val="lightGray"/>
+        </w:rPr>
+        <w:t>r</w:t>
+      </w:r>
+      <w:r>
+        <w:rPr>
+          <w:rFonts w:ascii="Arial" w:hAnsi="Arial" w:eastAsia="Arial" w:cs="Arial"/>
+          <w:b/>
+          <w:i w:val="0"/>
+          <w:color w:val="000000"/>
+          <w:sz w:val="18"/>
+          <w:highlight w:val="lightGray"/>
+        </w:rPr>
+        <w:t>e</w:t>
+      </w:r>
+      <w:r>
+        <w:rPr>
+          <w:rFonts w:ascii="Arial" w:hAnsi="Arial" w:eastAsia="Arial" w:cs="Arial"/>
+          <w:b/>
+          <w:i w:val="0"/>
+          <w:color w:val="000000"/>
+          <w:sz w:val="18"/>
+          <w:highlight w:val="lightGray"/>
+        </w:rPr>
+        <w:t>e</w:t>
+      </w:r>
+      <w:r>
+        <w:rPr>
+          <w:rFonts w:ascii="Arial" w:hAnsi="Arial" w:eastAsia="Arial" w:cs="Arial"/>
+          <w:b/>
+          <w:i w:val="0"/>
+          <w:color w:val="000000"/>
+          <w:sz w:val="18"/>
+          <w:highlight w:val="lightGray"/>
+        </w:rPr>
+        <w:t>n</w:t>
+      </w:r>
+      <w:r>
+        <w:rPr>
+          <w:rFonts w:ascii="Arial" w:hAnsi="Arial" w:eastAsia="Arial" w:cs="Arial"/>
+          <w:b/>
+          <w:i w:val="0"/>
+          <w:color w:val="000000"/>
+          <w:sz w:val="18"/>
+          <w:highlight w:val="lightGray"/>
+        </w:rPr>
+        <w:t>S</w:t>
+      </w:r>
+      <w:r>
+        <w:rPr>
+          <w:rFonts w:ascii="Arial" w:hAnsi="Arial" w:eastAsia="Arial" w:cs="Arial"/>
+          <w:b/>
+          <w:i w:val="0"/>
+          <w:color w:val="000000"/>
+          <w:sz w:val="18"/>
+          <w:highlight w:val="lightGray"/>
+        </w:rPr>
+        <w:t>h</w:t>
+      </w:r>
+      <w:r>
+        <w:rPr>
+          <w:rFonts w:ascii="Arial" w:hAnsi="Arial" w:eastAsia="Arial" w:cs="Arial"/>
+          <w:b/>
+          <w:i w:val="0"/>
+          <w:color w:val="000000"/>
+          <w:sz w:val="18"/>
+          <w:highlight w:val="lightGray"/>
+        </w:rPr>
+        <w:t>o</w:t>
+      </w:r>
+      <w:r>
+        <w:rPr>
+          <w:rFonts w:ascii="Arial" w:hAnsi="Arial" w:eastAsia="Arial" w:cs="Arial"/>
+          <w:b/>
+          <w:i w:val="0"/>
+          <w:color w:val="000000"/>
+          <w:sz w:val="18"/>
+          <w:highlight w:val="lightGray"/>
+        </w:rPr>
+        <w:t>t</w:t>
       </w:r>
       <w:r>
         <w:rPr>
@@ -789,7 +1229,7 @@
       </w:r>
       <w:r>
         <w:rPr>
-          <w:rFonts w:ascii="Arial" w:eastAsia="Arial" w:hAnsi="Arial" w:cs="Arial"/>
+          <w:rFonts w:ascii="Arial" w:hAnsi="Arial"/>
           <w:b/>
           <w:color w:val="000000"/>
           <w:sz w:val="18"/>
@@ -799,7 +1239,7 @@
       </w:r>
       <w:r>
         <w:rPr>
-          <w:rFonts w:ascii="Arial" w:eastAsia="Arial" w:hAnsi="Arial" w:cs="Arial"/>
+          <w:rFonts w:ascii="Arial" w:hAnsi="Arial"/>
           <w:color w:val="000000"/>
           <w:sz w:val="18"/>
           <w:highlight w:val="lightGray"/>

</xml_diff>